<commit_message>
Finito introduzione e conclusione
</commit_message>
<xml_diff>
--- a/Introduzione.docx
+++ b/Introduzione.docx
@@ -4,154 +4,104 @@
   <w:body>
     <w:p>
       <w:r>
-        <w:t xml:space="preserve">La gestione dei flussi di lavoro nei laboratori di prova richiede l'adozione di sistemi informativi dedicati in grado di garantire la conformità a rigidi standard di </w:t>
-      </w:r>
-      <w:r>
-        <w:rPr>
-          <w:i/>
-          <w:iCs/>
-        </w:rPr>
-        <w:t>Data Integrity</w:t>
-      </w:r>
-      <w:r>
-        <w:t>. A differenza dei sistemi ERP (</w:t>
-      </w:r>
-      <w:r>
-        <w:rPr>
-          <w:i/>
-          <w:iCs/>
-        </w:rPr>
-        <w:t>Enterprise Resource Planning</w:t>
-      </w:r>
-      <w:r>
-        <w:t>) general-purpose, che spesso mancano della granularità necessaria per tracciare processi operativi altamente specializzati, le moderne architetture web-based consentono l'implementazione di vincoli deterministici e controlli transazionali sui workflow analitici, riducendo il rischio di anomalie o alterazioni dei dati.</w:t>
+        <w:t>L’attività dei laboratori di prova richiede la gestione di processi operativi caratterizzati da elevati requisiti di tracciabilità, affidabilità e integrità dei dati. In particolare, nei contesti soggetti ad accreditamento e a procedure standardizzate, la corretta gestione delle informazioni assume un ruolo centrale per garantire la conformità normativa e la verificabilità delle operazioni svolte. Sebbene i sistemi informativi general-</w:t>
+      </w:r>
+      <w:proofErr w:type="spellStart"/>
+      <w:r>
+        <w:t>purpose</w:t>
+      </w:r>
+      <w:proofErr w:type="spellEnd"/>
+      <w:r>
+        <w:t xml:space="preserve"> possano supportare processi aziendali di carattere generale, contesti altamente specializzati richiedono spesso funzionalità dedicate per la gestione dei flussi operativi, del ciclo di vita dei dati e della registrazione delle attività effettuate dagli utenti.</w:t>
       </w:r>
     </w:p>
     <w:p>
       <w:r>
-        <w:t>Il presente lavoro di tesi si colloca in questo scenario, analizzando il caso di studio del CIAS (Centro ricerche Inquinamento Fisico Chimico Microbiologico Ambienti Alta Sterilità) dell’Università degli Studi di Ferrara. Il centro opera come laboratorio accreditato da ACCREDIA per l'esecuzione di prove microbiologiche normate (ai sensi degli standard UNI EN 13098, UNI EN ISO 4833, ISO 21527 e ISO 14698). L'infrastruttura software preesistente, denominata ENVASS v1, presentava limiti funzionali derivanti dalla parziale digitalizzazione del processo: il sistema limitava la persistenza dei dati alla sola fase di registrazione dei campioni. L'assenza di una gestione automatizzata degli stati del workflow e di un tracciamento nativo delle modifiche determinava frammentazione informativa e disallineamenti operativi, costituendo una criticità in sede di audit ispettivo.</w:t>
+        <w:t xml:space="preserve">Il presente lavoro di tesi si inserisce in questo contesto e prende in esame il caso di studio del CIAS (Centro ricerche Inquinamento Fisico Chimico Microbiologico Ambienti Alta Sterilità) dell’Università degli Studi di Ferrara. </w:t>
+      </w:r>
+      <w:r>
+        <w:t>Il centro opera come laboratorio accreditato da ACCREDIA per l’esecuzione di prove microbiologiche normate, in un contesto caratterizzato da stringenti requisiti di qualità, tracciabilità e integrità del dato.</w:t>
+      </w:r>
+      <w:r>
+        <w:t xml:space="preserve"> </w:t>
       </w:r>
     </w:p>
     <w:p>
       <w:r>
-        <w:t>Per superare tali limitazioni, si è proceduto alla progettazione e allo sviluppo della piattaforma ENVASS 2.0, ridefinendone l'intero ciclo di vita, dalla modellazione del database relazionale all'architettura backend e frontend. Il sistema è stato strutturato secondo una scomposizione modulare basata sul dominio applicativo, articolata in sei componenti principali: Anagrafica, Liste, Verbali, Analisi, Rapporti di prova e Sistema di logging.</w:t>
+        <w:t>L’infrastruttura software utilizzata dal laboratorio, denominata ENVASS v1, presentava alcune limitazioni dovute alla parziale digitalizzazione del processo operativo. Il sistema era infatti utilizzato principalmente come archivio per la registrazione dei campioni analizzati e dei relativi risultati finali, senza una gestione integrata del workflow analitico e della tracciabilità delle attività intermedie.</w:t>
+      </w:r>
+      <w:r>
+        <w:t xml:space="preserve"> </w:t>
+      </w:r>
+      <w:r>
+        <w:t>L’assenza di un sistema automatizzato di gestione degli stati del workflow e di meccanismi nativi di tracciamento delle modifiche poteva determinare frammentazione delle informazioni, disallineamenti tra i processi e difficoltà nella verifica delle attività durante le procedure ispettive.</w:t>
       </w:r>
     </w:p>
     <w:p>
       <w:r>
-        <w:t>Al fine di soddisfare i requisiti normativi di accreditamento, l'applicazione implementa vincoli transazionali a livello logico e di persistenza. In particolare, è stato integrato un meccanismo di immutabilità (</w:t>
-      </w:r>
-      <w:r>
-        <w:rPr>
-          <w:i/>
-          <w:iCs/>
-        </w:rPr>
-        <w:t>locking</w:t>
-      </w:r>
-      <w:r>
-        <w:t xml:space="preserve">) dei rapporti di prova validati, volto a impedirne la successiva alterazione. La verificabilità delle operazioni è garantita da un sottosistema di </w:t>
-      </w:r>
-      <w:r>
-        <w:rPr>
-          <w:i/>
-          <w:iCs/>
-        </w:rPr>
-        <w:t>audit trail</w:t>
-      </w:r>
-      <w:r>
-        <w:t xml:space="preserve"> e </w:t>
-      </w:r>
-      <w:r>
-        <w:rPr>
-          <w:i/>
-          <w:iCs/>
-        </w:rPr>
-        <w:t>authentication logging</w:t>
-      </w:r>
-      <w:r>
-        <w:t>, configurato per registrare in modo permanente e non modificabile i tentativi di accesso e i mutamenti di stato delle entità di sistema.</w:t>
+        <w:t>L’obiettivo del presente lavoro è stato quello di progettare e sviluppare una nuova piattaforma software, denominata ENVASS 2.0, finalizzata alla digitalizzazione completa del processo laboratoristico e orientata al rispetto dei requisiti di tracciabilità e integrità del dato richiesti in ambito accreditato. L’attività svolta ha interessato la definizione dell’architettura applicativa, la progettazione della base dati e l’implementazione delle componenti software necessarie alla gestione dell’intero ciclo di vita delle analisi.</w:t>
       </w:r>
     </w:p>
     <w:p>
       <w:r>
-        <w:t>L’elaborato è organizzato in cinque capitoli:</w:t>
+        <w:t xml:space="preserve">Particolare attenzione è stata dedicata all’implementazione di meccanismi volti a garantire la consistenza e la verificabilità delle informazioni gestite dal sistema. Tra questi rientrano procedure di controllo dello stato dei processi, sistemi di audit </w:t>
+      </w:r>
+      <w:proofErr w:type="spellStart"/>
+      <w:r>
+        <w:t>trail</w:t>
+      </w:r>
+      <w:proofErr w:type="spellEnd"/>
+      <w:r>
+        <w:t xml:space="preserve"> per la registrazione delle operazioni effettuate e meccanismi di protezione dei rapporti di prova validati, finalizzati a impedirne modifiche successive non autorizzate.</w:t>
       </w:r>
     </w:p>
     <w:p>
-      <w:pPr>
-        <w:numPr>
-          <w:ilvl w:val="0"/>
-          <w:numId w:val="1"/>
-        </w:numPr>
-      </w:pPr>
-      <w:r>
-        <w:rPr>
-          <w:b/>
-          <w:bCs/>
-        </w:rPr>
-        <w:t>Capitolo 2:</w:t>
-      </w:r>
-      <w:r>
-        <w:t xml:space="preserve"> esamina lo stack tecnologico adottato, con specifico riferimento all'architettura e alle funzionalità del framework Laravel.</w:t>
+      <w:r>
+        <w:t xml:space="preserve">’elaborato è articolato in cinque capitoli, incluso il presente capitolo introduttivo. Il Capitolo 2 fornisce </w:t>
+      </w:r>
+      <w:proofErr w:type="gramStart"/>
+      <w:r>
+        <w:t>il background tecnologico necessario</w:t>
+      </w:r>
+      <w:proofErr w:type="gramEnd"/>
+      <w:r>
+        <w:t xml:space="preserve"> alla comprensione del lavoro, con particolare riferimento alle tecnologie web, al linguaggio PHP e al framework </w:t>
+      </w:r>
+      <w:proofErr w:type="spellStart"/>
+      <w:r>
+        <w:t>Laravel</w:t>
+      </w:r>
+      <w:proofErr w:type="spellEnd"/>
+      <w:r>
+        <w:t xml:space="preserve">. </w:t>
+      </w:r>
+      <w:r>
+        <w:t xml:space="preserve"> </w:t>
+      </w:r>
+      <w:r>
+        <w:t>Il Capitolo 3 descrive il contesto applicativo del CIAS, illustrandone l’organizzazione e i requisiti, e presenta il progetto ENVASS, analizzandone la struttura funzionale.</w:t>
+      </w:r>
+      <w:r>
+        <w:t xml:space="preserve"> </w:t>
+      </w:r>
+      <w:r>
+        <w:t>Il Capitolo 4 presenta le principali scelte implementative e le soluzioni adottate nello sviluppo del sistema. Infine, il Capitolo 5 riporta le conclusioni del lavoro e propone possibili sviluppi futuri.</w:t>
       </w:r>
     </w:p>
+    <w:p/>
     <w:p>
       <w:pPr>
-        <w:numPr>
-          <w:ilvl w:val="0"/>
-          <w:numId w:val="1"/>
-        </w:numPr>
+        <w:rPr>
+          <w:u w:val="single"/>
+        </w:rPr>
       </w:pPr>
-      <w:r>
-        <w:rPr>
-          <w:b/>
-          <w:bCs/>
-        </w:rPr>
-        <w:t>Capitolo 3:</w:t>
-      </w:r>
-      <w:r>
-        <w:t xml:space="preserve"> analizza i requisiti di dominio e descrive la progettazione dell’architettura logica e della base dati.</w:t>
-      </w:r>
     </w:p>
-    <w:p>
-      <w:pPr>
-        <w:numPr>
-          <w:ilvl w:val="0"/>
-          <w:numId w:val="1"/>
-        </w:numPr>
-      </w:pPr>
-      <w:r>
-        <w:rPr>
-          <w:b/>
-          <w:bCs/>
-        </w:rPr>
-        <w:t>Capitolo 4:</w:t>
-      </w:r>
-      <w:r>
-        <w:t xml:space="preserve"> illustra le soluzioni implementative, i pattern di design adottati e le strategie di sviluppo del codice.</w:t>
-      </w:r>
-      <w:r>
-        <w:t xml:space="preserve"> </w:t>
-      </w:r>
-    </w:p>
-    <w:p>
-      <w:pPr>
-        <w:numPr>
-          <w:ilvl w:val="0"/>
-          <w:numId w:val="1"/>
-        </w:numPr>
-      </w:pPr>
-      <w:r>
-        <w:rPr>
-          <w:b/>
-          <w:bCs/>
-        </w:rPr>
-        <w:t>Capitolo 5:</w:t>
-      </w:r>
-      <w:r>
-        <w:t xml:space="preserve"> presenta i risultati della fase di validazione del software e delinea i possibili sviluppi evolutivi del sistema.</w:t>
-      </w:r>
-    </w:p>
+    <w:p/>
+    <w:p/>
+    <w:p/>
+    <w:p/>
+    <w:p/>
+    <w:p/>
     <w:p/>
     <w:sectPr>
       <w:pgSz w:w="11906" w:h="16838"/>
@@ -1236,6 +1186,19 @@
       <w:spacing w:val="5"/>
     </w:rPr>
   </w:style>
+  <w:style w:type="paragraph" w:styleId="NormaleWeb">
+    <w:name w:val="Normal (Web)"/>
+    <w:basedOn w:val="Normale"/>
+    <w:uiPriority w:val="99"/>
+    <w:semiHidden/>
+    <w:unhideWhenUsed/>
+    <w:rsid w:val="00942620"/>
+    <w:rPr>
+      <w:rFonts w:ascii="Times New Roman" w:hAnsi="Times New Roman" w:cs="Times New Roman"/>
+      <w:sz w:val="24"/>
+      <w:szCs w:val="24"/>
+    </w:rPr>
+  </w:style>
 </w:styles>
 </file>
 

</xml_diff>